<commit_message>
Update README screenshots and finalize documentation
</commit_message>
<xml_diff>
--- a/docs/StegoVault_Project_Report.docx
+++ b/docs/StegoVault_Project_Report.docx
@@ -58,7 +58,7 @@
           <w:color w:val="2B6CB0"/>
           <w:sz w:val="26"/>
         </w:rPr>
-        <w:t>Cryptographic Steganography &amp; Forensic Steganalysis Toolkit</w:t>
+        <w:t>Cryptographic Steganography and Steganalysis Toolkit</w:t>
         <w:br/>
         <w:t>A Defense-in-Depth Framework for Authenticated Secret Data Concealment</w:t>
       </w:r>
@@ -441,7 +441,7 @@
           <w:color w:val="2D3748"/>
           <w:sz w:val="22"/>
         </w:rPr>
-        <w:t>This is to certify that the project entitled "STEGOVAULT — Cryptographic Steganography &amp; Steganalysis Toolkit" is a bonafide work carried out by Candidate Name (Roll No: CS-2022-XXXX) in partial fulfillment of the requirements for the award of the degree of Bachelor of Technology in Computer Science &amp; Engineering during the academic year 2025–2026.</w:t>
+        <w:t>This is to certify that the project entitled "STEGOVAULT — Cryptographic Steganography and Steganalysis Toolkit" is a bonafide work carried out by Candidate Name (Roll No: CS-2022-XXXX) in partial fulfillment of the requirements for the award of the degree of Bachelor of Technology in Computer Science &amp; Engineering during the academic year 2025–2026.</w:t>
       </w:r>
     </w:p>
     <w:p>
@@ -3544,7 +3544,7 @@
                 <w:color w:val="2D3748"/>
                 <w:sz w:val="19"/>
               </w:rPr>
-              <w:t>AES-256-GCM + Poly1305</w:t>
+              <w:t>AES-256-GCM (128-bit GHASH)</w:t>
             </w:r>
           </w:p>
         </w:tc>
@@ -9570,7 +9570,7 @@
       <w:r>
         <w:drawing>
           <wp:inline xmlns:a="http://schemas.openxmlformats.org/drawingml/2006/main" xmlns:pic="http://schemas.openxmlformats.org/drawingml/2006/picture">
-            <wp:extent cx="5303520" cy="2983230"/>
+            <wp:extent cx="5303520" cy="3535680"/>
             <wp:docPr id="1" name="Picture 1"/>
             <wp:cNvGraphicFramePr>
               <a:graphicFrameLocks noChangeAspect="1"/>
@@ -9579,7 +9579,7 @@
               <a:graphicData uri="http://schemas.openxmlformats.org/drawingml/2006/picture">
                 <pic:pic>
                   <pic:nvPicPr>
-                    <pic:cNvPr id="0" name="01-dashboard.png"/>
+                    <pic:cNvPr id="0" name="fig01_dashboard_overview.png"/>
                     <pic:cNvPicPr/>
                   </pic:nvPicPr>
                   <pic:blipFill>
@@ -9591,7 +9591,7 @@
                   <pic:spPr>
                     <a:xfrm>
                       <a:off x="0" y="0"/>
-                      <a:ext cx="5303520" cy="2983230"/>
+                      <a:ext cx="5303520" cy="3535680"/>
                     </a:xfrm>
                     <a:prstGeom prst="rect"/>
                   </pic:spPr>
@@ -9625,7 +9625,7 @@
       <w:r>
         <w:drawing>
           <wp:inline xmlns:a="http://schemas.openxmlformats.org/drawingml/2006/main" xmlns:pic="http://schemas.openxmlformats.org/drawingml/2006/picture">
-            <wp:extent cx="5303520" cy="2983230"/>
+            <wp:extent cx="5303520" cy="3535680"/>
             <wp:docPr id="2" name="Picture 2"/>
             <wp:cNvGraphicFramePr>
               <a:graphicFrameLocks noChangeAspect="1"/>
@@ -9634,7 +9634,7 @@
               <a:graphicData uri="http://schemas.openxmlformats.org/drawingml/2006/picture">
                 <pic:pic>
                   <pic:nvPicPr>
-                    <pic:cNvPr id="0" name="02-encode.png"/>
+                    <pic:cNvPr id="0" name="fig02_encode_configured.png"/>
                     <pic:cNvPicPr/>
                   </pic:nvPicPr>
                   <pic:blipFill>
@@ -9646,7 +9646,7 @@
                   <pic:spPr>
                     <a:xfrm>
                       <a:off x="0" y="0"/>
-                      <a:ext cx="5303520" cy="2983230"/>
+                      <a:ext cx="5303520" cy="3535680"/>
                     </a:xfrm>
                     <a:prstGeom prst="rect"/>
                   </pic:spPr>
@@ -9680,7 +9680,7 @@
       <w:r>
         <w:drawing>
           <wp:inline xmlns:a="http://schemas.openxmlformats.org/drawingml/2006/main" xmlns:pic="http://schemas.openxmlformats.org/drawingml/2006/picture">
-            <wp:extent cx="5303520" cy="2983230"/>
+            <wp:extent cx="5303520" cy="3535680"/>
             <wp:docPr id="3" name="Picture 3"/>
             <wp:cNvGraphicFramePr>
               <a:graphicFrameLocks noChangeAspect="1"/>
@@ -9689,7 +9689,7 @@
               <a:graphicData uri="http://schemas.openxmlformats.org/drawingml/2006/picture">
                 <pic:pic>
                   <pic:nvPicPr>
-                    <pic:cNvPr id="0" name="03-encode-success.png"/>
+                    <pic:cNvPr id="0" name="fig03_encode_success.png"/>
                     <pic:cNvPicPr/>
                   </pic:nvPicPr>
                   <pic:blipFill>
@@ -9701,7 +9701,7 @@
                   <pic:spPr>
                     <a:xfrm>
                       <a:off x="0" y="0"/>
-                      <a:ext cx="5303520" cy="2983230"/>
+                      <a:ext cx="5303520" cy="3535680"/>
                     </a:xfrm>
                     <a:prstGeom prst="rect"/>
                   </pic:spPr>
@@ -9735,7 +9735,7 @@
       <w:r>
         <w:drawing>
           <wp:inline xmlns:a="http://schemas.openxmlformats.org/drawingml/2006/main" xmlns:pic="http://schemas.openxmlformats.org/drawingml/2006/picture">
-            <wp:extent cx="5303520" cy="2983230"/>
+            <wp:extent cx="5303520" cy="3535680"/>
             <wp:docPr id="4" name="Picture 4"/>
             <wp:cNvGraphicFramePr>
               <a:graphicFrameLocks noChangeAspect="1"/>
@@ -9744,7 +9744,7 @@
               <a:graphicData uri="http://schemas.openxmlformats.org/drawingml/2006/picture">
                 <pic:pic>
                   <pic:nvPicPr>
-                    <pic:cNvPr id="0" name="04-decode-success.png"/>
+                    <pic:cNvPr id="0" name="fig04_decode_success.png"/>
                     <pic:cNvPicPr/>
                   </pic:nvPicPr>
                   <pic:blipFill>
@@ -9756,7 +9756,7 @@
                   <pic:spPr>
                     <a:xfrm>
                       <a:off x="0" y="0"/>
-                      <a:ext cx="5303520" cy="2983230"/>
+                      <a:ext cx="5303520" cy="3535680"/>
                     </a:xfrm>
                     <a:prstGeom prst="rect"/>
                   </pic:spPr>

</xml_diff>